<commit_message>
SetUpGuide: setup, update to cpmodelai repos, three tools; add CloneRepos.bat
Part 1 Setup unchanged. Part 2 Update: move to the cpmodelai addresses
with the new RepoDirectory.csv and check folder names. Part 3 Tools:
each tool starts with its repo address; new Tool 3, make an update to
CPAT-AI. CloneRepos.bat (referred to in Action C, but missing) clones
the repos in RepoDirectory.csv and flags folders on old addresses.
Repos.zip rebuilt.

Co-Authored-By: Claude Opus 5.5 <noreply@anthropic.com>
Claude-Session: https://claude.ai/code/session_01VSHkeJNKscUdbXyx6Mjtov
</commit_message>
<xml_diff>
--- a/SetUpGuide.docx
+++ b/SetUpGuide.docx
@@ -14,6 +14,30 @@
       </w:r>
       <w:r>
         <w:t xml:space="preserve"> AI in Climate-Fiscal Team</w:t>
+      </w:r>
+    </w:p>
+    <w:p>
+      <w:proofErr w:type="gramStart"/>
+      <w:proofErr w:type="gramEnd"/>
+      <w:r>
+        <w:rPr>
+          <w:b/>
+        </w:rPr>
+        <w:t xml:space="preserve">This guide has three parts. </w:t>
+      </w:r>
+      <w:r>
+        <w:t>Part 1, Setup: new users, once. Part 2, Update: if you set up before the repos moved to github.com/cpmodelai, once. Part 3, Tools: how to use the three tools.</w:t>
+      </w:r>
+    </w:p>
+    <w:p>
+      <w:pPr>
+        <w:pStyle w:val="Heading1"/>
+      </w:pPr>
+      <w:r>
+        <w:rPr>
+          <w:color w:val="1F3864"/>
+        </w:rPr>
+        <w:t>Part 1. Setup (new users)</w:t>
       </w:r>
     </w:p>
     <w:p>
@@ -799,14 +823,497 @@
     </w:p>
     <w:p>
       <w:pPr>
-        <w:pStyle w:val="Title"/>
-      </w:pPr>
-      <w:r>
-        <w:rPr>
-          <w:sz w:val="52"/>
-        </w:rPr>
-        <w:lastRenderedPageBreak/>
-        <w:t>AI Tools Quick Start</w:t>
+        <w:pStyle w:val="Heading1"/>
+      </w:pPr>
+      <w:r>
+        <w:rPr>
+          <w:color w:val="1F3864"/>
+        </w:rPr>
+        <w:t>Part 2. Update to the new repos (existing users)</w:t>
+      </w:r>
+    </w:p>
+    <w:p>
+      <w:proofErr w:type="gramStart"/>
+      <w:proofErr w:type="gramEnd"/>
+      <w:r>
+        <w:t>The repos have moved from github.com/cpmodel to github.com/cpmodelai, and some default folder names have changed. If you set up before this, do these steps once. The new RepoDirectory.csv in Repos.zip lists the new addresses.</w:t>
+      </w:r>
+    </w:p>
+    <w:tbl>
+      <w:tblPr>
+        <w:tblW w:type="auto" w:w="0"/>
+        <w:tblLook w:firstColumn="1" w:firstRow="1" w:lastColumn="0" w:lastRow="0" w:noHBand="0" w:noVBand="1" w:val="04A0"/>
+        <w:tblBorders>
+          <w:top w:val="single" w:sz="4" w:color="BFBFBF"/>
+          <w:left w:val="single" w:sz="4" w:color="BFBFBF"/>
+          <w:bottom w:val="single" w:sz="4" w:color="BFBFBF"/>
+          <w:right w:val="single" w:sz="4" w:color="BFBFBF"/>
+          <w:insideH w:val="single" w:sz="4" w:color="BFBFBF"/>
+          <w:insideV w:val="single" w:sz="4" w:color="BFBFBF"/>
+        </w:tblBorders>
+      </w:tblPr>
+      <w:tblGrid>
+        <w:gridCol w:w="2340"/>
+        <w:gridCol w:w="2340"/>
+        <w:gridCol w:w="2340"/>
+        <w:gridCol w:w="2340"/>
+      </w:tblGrid>
+      <w:tr>
+        <w:tc>
+          <w:tcPr>
+            <w:tcW w:type="dxa" w:w="1872"/>
+            <w:shd w:val="clear" w:fill="EEF3F9"/>
+          </w:tcPr>
+          <w:p>
+            <w:r/>
+            <w:r>
+              <w:rPr>
+                <w:b/>
+                <w:sz w:val="19"/>
+              </w:rPr>
+              <w:t>Repo</w:t>
+            </w:r>
+          </w:p>
+        </w:tc>
+        <w:tc>
+          <w:tcPr>
+            <w:tcW w:type="dxa" w:w="2520"/>
+            <w:shd w:val="clear" w:fill="EEF3F9"/>
+          </w:tcPr>
+          <w:p>
+            <w:r/>
+            <w:r>
+              <w:rPr>
+                <w:b/>
+                <w:sz w:val="19"/>
+              </w:rPr>
+              <w:t>Old address</w:t>
+            </w:r>
+          </w:p>
+        </w:tc>
+        <w:tc>
+          <w:tcPr>
+            <w:tcW w:type="dxa" w:w="2880"/>
+            <w:shd w:val="clear" w:fill="EEF3F9"/>
+          </w:tcPr>
+          <w:p>
+            <w:r/>
+            <w:r>
+              <w:rPr>
+                <w:b/>
+                <w:sz w:val="19"/>
+              </w:rPr>
+              <w:t>New address (RepoName)</w:t>
+            </w:r>
+          </w:p>
+        </w:tc>
+        <w:tc>
+          <w:tcPr>
+            <w:tcW w:type="dxa" w:w="2088"/>
+            <w:shd w:val="clear" w:fill="EEF3F9"/>
+          </w:tcPr>
+          <w:p>
+            <w:r/>
+            <w:r>
+              <w:rPr>
+                <w:b/>
+                <w:sz w:val="19"/>
+              </w:rPr>
+              <w:t>Default folder (FolderName)</w:t>
+            </w:r>
+          </w:p>
+        </w:tc>
+      </w:tr>
+      <w:tr>
+        <w:tc>
+          <w:tcPr>
+            <w:tcW w:type="dxa" w:w="1872"/>
+          </w:tcPr>
+          <w:p>
+            <w:r/>
+            <w:r>
+              <w:rPr>
+                <w:b w:val="0"/>
+                <w:sz w:val="19"/>
+              </w:rPr>
+              <w:t>Climate-fiscal AI tools</w:t>
+            </w:r>
+          </w:p>
+        </w:tc>
+        <w:tc>
+          <w:tcPr>
+            <w:tcW w:type="dxa" w:w="2520"/>
+          </w:tcPr>
+          <w:p>
+            <w:r/>
+            <w:r>
+              <w:rPr>
+                <w:b w:val="0"/>
+                <w:sz w:val="19"/>
+              </w:rPr>
+              <w:t>github.com/cpmodel/new-ai-tools</w:t>
+            </w:r>
+          </w:p>
+        </w:tc>
+        <w:tc>
+          <w:tcPr>
+            <w:tcW w:type="dxa" w:w="2880"/>
+          </w:tcPr>
+          <w:p>
+            <w:r/>
+            <w:r>
+              <w:rPr>
+                <w:b w:val="0"/>
+                <w:sz w:val="19"/>
+              </w:rPr>
+              <w:t>github.com/cpmodelai/climate-fiscal-ai-tools</w:t>
+            </w:r>
+          </w:p>
+        </w:tc>
+        <w:tc>
+          <w:tcPr>
+            <w:tcW w:type="dxa" w:w="2088"/>
+          </w:tcPr>
+          <w:p>
+            <w:r/>
+            <w:r>
+              <w:rPr>
+                <w:b w:val="0"/>
+                <w:sz w:val="19"/>
+              </w:rPr>
+              <w:t>climate-fiscal-ai-tools (was new-ai-tools)</w:t>
+            </w:r>
+          </w:p>
+        </w:tc>
+      </w:tr>
+      <w:tr>
+        <w:tc>
+          <w:tcPr>
+            <w:tcW w:type="dxa" w:w="1872"/>
+          </w:tcPr>
+          <w:p>
+            <w:r/>
+            <w:r>
+              <w:rPr>
+                <w:b w:val="0"/>
+                <w:sz w:val="19"/>
+              </w:rPr>
+              <w:t>CPAT-AI</w:t>
+            </w:r>
+          </w:p>
+        </w:tc>
+        <w:tc>
+          <w:tcPr>
+            <w:tcW w:type="dxa" w:w="2520"/>
+          </w:tcPr>
+          <w:p>
+            <w:r/>
+            <w:r>
+              <w:rPr>
+                <w:b w:val="0"/>
+                <w:sz w:val="19"/>
+              </w:rPr>
+              <w:t>github.com/cpmodel/CPAT-AI</w:t>
+            </w:r>
+          </w:p>
+        </w:tc>
+        <w:tc>
+          <w:tcPr>
+            <w:tcW w:type="dxa" w:w="2880"/>
+          </w:tcPr>
+          <w:p>
+            <w:r/>
+            <w:r>
+              <w:rPr>
+                <w:b w:val="0"/>
+                <w:sz w:val="19"/>
+              </w:rPr>
+              <w:t>github.com/cpmodelai/cpat_ai</w:t>
+            </w:r>
+          </w:p>
+        </w:tc>
+        <w:tc>
+          <w:tcPr>
+            <w:tcW w:type="dxa" w:w="2088"/>
+          </w:tcPr>
+          <w:p>
+            <w:r/>
+            <w:r>
+              <w:rPr>
+                <w:b w:val="0"/>
+                <w:sz w:val="19"/>
+              </w:rPr>
+              <w:t>CPAT-AI</w:t>
+            </w:r>
+          </w:p>
+        </w:tc>
+      </w:tr>
+      <w:tr>
+        <w:tc>
+          <w:tcPr>
+            <w:tcW w:type="dxa" w:w="1872"/>
+          </w:tcPr>
+          <w:p>
+            <w:r/>
+            <w:r>
+              <w:rPr>
+                <w:b w:val="0"/>
+                <w:sz w:val="19"/>
+              </w:rPr>
+              <w:t>Repo tools</w:t>
+            </w:r>
+          </w:p>
+        </w:tc>
+        <w:tc>
+          <w:tcPr>
+            <w:tcW w:type="dxa" w:w="2520"/>
+          </w:tcPr>
+          <w:p>
+            <w:r/>
+            <w:r>
+              <w:rPr>
+                <w:b w:val="0"/>
+                <w:sz w:val="19"/>
+              </w:rPr>
+              <w:t>(new)</w:t>
+            </w:r>
+          </w:p>
+        </w:tc>
+        <w:tc>
+          <w:tcPr>
+            <w:tcW w:type="dxa" w:w="2880"/>
+          </w:tcPr>
+          <w:p>
+            <w:r/>
+            <w:r>
+              <w:rPr>
+                <w:b w:val="0"/>
+                <w:sz w:val="19"/>
+              </w:rPr>
+              <w:t>github.com/cpmodelai/repo-tools</w:t>
+            </w:r>
+          </w:p>
+        </w:tc>
+        <w:tc>
+          <w:tcPr>
+            <w:tcW w:type="dxa" w:w="2088"/>
+          </w:tcPr>
+          <w:p>
+            <w:r/>
+            <w:r>
+              <w:rPr>
+                <w:b w:val="0"/>
+                <w:sz w:val="19"/>
+              </w:rPr>
+              <w:t>repo-tools</w:t>
+            </w:r>
+          </w:p>
+        </w:tc>
+      </w:tr>
+    </w:tbl>
+    <w:p/>
+    <w:p>
+      <w:pPr>
+        <w:ind w:left="397" w:hanging="397"/>
+      </w:pPr>
+      <w:r>
+        <w:rPr>
+          <w:b/>
+        </w:rPr>
+        <w:t>1.</w:t>
+        <w:tab/>
+      </w:r>
+      <w:r>
+        <w:rPr>
+          <w:b/>
+        </w:rPr>
+        <w:t xml:space="preserve">Save your work first. </w:t>
+      </w:r>
+      <w:r>
+        <w:t>Double-click SyncAllRepos.bat (or see Step 3 in Part 3) so nothing is lost. If a push fails, copy the files you changed somewhere safe.</w:t>
+      </w:r>
+    </w:p>
+    <w:p>
+      <w:pPr>
+        <w:ind w:left="397" w:hanging="397"/>
+      </w:pPr>
+      <w:r>
+        <w:rPr>
+          <w:b/>
+        </w:rPr>
+        <w:t>2.</w:t>
+        <w:tab/>
+      </w:r>
+      <w:r>
+        <w:rPr>
+          <w:b/>
+        </w:rPr>
+        <w:t xml:space="preserve">Get the new files. </w:t>
+      </w:r>
+      <w:r>
+        <w:t>Download Repos.zip (link in Action C, or from github.com/cpmodelai/repo-tools) and extract it into C:\Users\WB&lt;PID&gt;\Repos. Let it replace RepoDirectory.csv, SyncAllRepos.bat and CloneRepos.bat.</w:t>
+      </w:r>
+    </w:p>
+    <w:p>
+      <w:pPr>
+        <w:ind w:left="397" w:hanging="397"/>
+      </w:pPr>
+      <w:r>
+        <w:rPr>
+          <w:b/>
+        </w:rPr>
+        <w:t>3.</w:t>
+        <w:tab/>
+      </w:r>
+      <w:r>
+        <w:rPr>
+          <w:b/>
+        </w:rPr>
+        <w:t xml:space="preserve">Check the addresses. </w:t>
+      </w:r>
+      <w:r>
+        <w:t>Open RepoDirectory.csv in Notepad. Every RepoName must start with https://github.com/cpmodelai/ (not cpmodel).</w:t>
+      </w:r>
+    </w:p>
+    <w:p>
+      <w:pPr>
+        <w:ind w:left="397" w:hanging="397"/>
+      </w:pPr>
+      <w:r>
+        <w:rPr>
+          <w:b/>
+        </w:rPr>
+        <w:t>4.</w:t>
+        <w:tab/>
+      </w:r>
+      <w:r>
+        <w:rPr>
+          <w:b/>
+        </w:rPr>
+        <w:t xml:space="preserve">Check the folder names. </w:t>
+      </w:r>
+      <w:r>
+        <w:t>FolderName is the folder inside Repos for each repo, and it must match exactly. The defaults have changed (table above), so compare them with your folders. Use the default (and move the old folder aside, step 5), or change FolderName to the name you want.</w:t>
+      </w:r>
+    </w:p>
+    <w:p>
+      <w:pPr>
+        <w:ind w:left="397" w:hanging="397"/>
+      </w:pPr>
+      <w:r>
+        <w:rPr>
+          <w:b/>
+        </w:rPr>
+        <w:t>5.</w:t>
+        <w:tab/>
+      </w:r>
+      <w:r>
+        <w:rPr>
+          <w:b/>
+        </w:rPr>
+        <w:t xml:space="preserve">Move the old folders aside. </w:t>
+      </w:r>
+      <w:r>
+        <w:t>Rename each old folder, for example new-ai-tools to new-ai-tools_old and CPAT-AI to CPAT-AI_old. They still point to the old addresses.</w:t>
+      </w:r>
+    </w:p>
+    <w:p>
+      <w:pPr>
+        <w:ind w:left="397" w:hanging="397"/>
+      </w:pPr>
+      <w:r>
+        <w:rPr>
+          <w:b/>
+        </w:rPr>
+        <w:t>6.</w:t>
+        <w:tab/>
+      </w:r>
+      <w:r>
+        <w:rPr>
+          <w:b/>
+        </w:rPr>
+        <w:t xml:space="preserve">Download the new repos. </w:t>
+      </w:r>
+      <w:r>
+        <w:t>Double-click CloneRepos.bat. It downloads every repo in RepoDirectory.csv whose folder is missing, and warns about any folder that points to another address. Sign in to GitHub if asked; your ID must be in cpmodelai (Action D).</w:t>
+      </w:r>
+    </w:p>
+    <w:p>
+      <w:pPr>
+        <w:ind w:left="397" w:hanging="397"/>
+      </w:pPr>
+      <w:r>
+        <w:rPr>
+          <w:b/>
+        </w:rPr>
+        <w:t>7.</w:t>
+        <w:tab/>
+      </w:r>
+      <w:r>
+        <w:rPr>
+          <w:b/>
+        </w:rPr>
+        <w:t xml:space="preserve">Copy across and check. </w:t>
+      </w:r>
+      <w:r>
+        <w:t>Copy any unsaved files from the _old folders into the new ones. Double-click SyncAllRepos.bat: every repo shows Pulling, none shows [SKIP] Folder not found. Then delete the _old folders.</w:t>
+      </w:r>
+    </w:p>
+    <w:p>
+      <w:pPr>
+        <w:ind w:left="397" w:hanging="397"/>
+      </w:pPr>
+      <w:r>
+        <w:rPr>
+          <w:b/>
+        </w:rPr>
+        <w:t>8.</w:t>
+        <w:tab/>
+      </w:r>
+      <w:r>
+        <w:rPr>
+          <w:b/>
+        </w:rPr>
+        <w:t xml:space="preserve">Update the Copilot app. </w:t>
+      </w:r>
+      <w:r>
+        <w:t>Add the new folders in the sidebar (Part 3, Step 1) and remove the old ones.</w:t>
+      </w:r>
+    </w:p>
+    <w:p>
+      <w:proofErr w:type="spellStart"/>
+      <w:proofErr w:type="spellEnd"/>
+      <w:r>
+        <w:rPr>
+          <w:b/>
+        </w:rPr>
+        <w:t xml:space="preserve">Check: </w:t>
+      </w:r>
+      <w:r>
+        <w:rPr>
+          <w:b w:val="0"/>
+        </w:rPr>
+        <w:t>CloneRepos.bat shows [OK] for every repo. In each repo folder, git remote -v shows https://github.com/cpmodelai/...</w:t>
+      </w:r>
+    </w:p>
+    <w:p>
+      <w:r>
+        <w:rPr>
+          <w:i/>
+        </w:rPr>
+        <w:t>Download fresh rather than re-pointing the old folders: the new repos do not share all of the old history, so pulls into an old folder can fail.</w:t>
+      </w:r>
+    </w:p>
+    <w:p/>
+    <w:p>
+      <w:pPr>
+        <w:pStyle w:val="Heading1"/>
+      </w:pPr>
+      <w:r>
+        <w:rPr>
+          <w:color w:val="1F3864"/>
+        </w:rPr>
+        <w:t>Part 3. Tools (GitHub Copilot app)</w:t>
       </w:r>
     </w:p>
     <w:p>
@@ -815,14 +1322,17 @@
           <w:i/>
           <w:color w:val="404040"/>
         </w:rPr>
-        <w:t xml:space="preserve">Two examples with the GitHub Copilot app. </w:t>
-      </w:r>
-    </w:p>
-    <w:p>
-      <w:pPr>
-        <w:pStyle w:val="Heading1"/>
-      </w:pPr>
-      <w:r>
+        <w:t>AI Tools Quick Start: three tools, each in its own repo. The repo address is at the start of each tool.</w:t>
+      </w:r>
+    </w:p>
+    <w:p>
+      <w:pPr>
+        <w:pStyle w:val="Heading2"/>
+      </w:pPr>
+      <w:r>
+        <w:rPr>
+          <w:color w:val="1F3864"/>
+        </w:rPr>
         <w:t>We assume you already have</w:t>
       </w:r>
     </w:p>
@@ -835,54 +1345,47 @@
         <w:t xml:space="preserve">✓  </w:t>
       </w:r>
       <w:r>
+        <w:t>The repo for your tool downloaded on your laptop (C:\Users\WB&lt;PID&gt;\Repos\&lt;folder&gt;, Part 1 or 2) and up to date.</w:t>
+      </w:r>
+      <w:proofErr w:type="gramEnd"/>
+      <w:r/>
+      <w:r/>
+      <w:r/>
+    </w:p>
+    <w:p>
+      <w:proofErr w:type="gramStart"/>
+      <w:r>
+        <w:rPr>
+          <w:b/>
+        </w:rPr>
+        <w:t xml:space="preserve">✓  </w:t>
+      </w:r>
+      <w:r>
         <w:t>The</w:t>
       </w:r>
       <w:proofErr w:type="gramEnd"/>
       <w:r>
-        <w:t xml:space="preserve"> new-ai-tools repo downloaded on your laptop (C:\Users\&lt;you&gt;\Repos\</w:t>
-      </w:r>
-      <w:r>
-        <w:t>climate-fiscal</w:t>
-      </w:r>
-      <w:r>
-        <w:t>-ai-tools) and up to date.</w:t>
-      </w:r>
-    </w:p>
-    <w:p>
+        <w:t xml:space="preserve"> GitHub Copilot app installed (Microsoft Store) and signed in with your GitHub account.</w:t>
+      </w:r>
+    </w:p>
+    <w:p>
+      <w:pPr>
+        <w:rPr>
+          <w:bCs/>
+        </w:rPr>
+      </w:pPr>
       <w:proofErr w:type="gramStart"/>
       <w:r>
         <w:rPr>
-          <w:b/>
-        </w:rPr>
-        <w:t xml:space="preserve">✓  </w:t>
-      </w:r>
-      <w:r>
-        <w:t>The</w:t>
+          <w:bCs/>
+        </w:rPr>
+        <w:t>✓  Part 1 done (and Part 2 if you set up before the move)</w:t>
       </w:r>
       <w:proofErr w:type="gramEnd"/>
       <w:r>
-        <w:t xml:space="preserve"> GitHub Copilot app installed (Microsoft Store) and signed in with your GitHub account.</w:t>
-      </w:r>
-    </w:p>
-    <w:p>
-      <w:pPr>
         <w:rPr>
           <w:bCs/>
         </w:rPr>
-      </w:pPr>
-      <w:proofErr w:type="gramStart"/>
-      <w:r>
-        <w:rPr>
-          <w:bCs/>
-        </w:rPr>
-        <w:t>✓  Other</w:t>
-      </w:r>
-      <w:proofErr w:type="gramEnd"/>
-      <w:r>
-        <w:rPr>
-          <w:bCs/>
-        </w:rPr>
-        <w:t xml:space="preserve"> steps above</w:t>
       </w:r>
     </w:p>
     <w:p>
@@ -895,14 +1398,17 @@
     </w:p>
     <w:p>
       <w:r>
-        <w:t>Steps 1-2 set up a session. Then do Example 1 or Example 2. Step 3 saves your work.</w:t>
-      </w:r>
-    </w:p>
-    <w:p>
-      <w:pPr>
-        <w:pStyle w:val="Heading1"/>
-      </w:pPr>
-      <w:r>
+        <w:t>Steps 1-2 set up a session. Then do Tool 1, 2 or 3. Step 3 saves your work.</w:t>
+      </w:r>
+    </w:p>
+    <w:p>
+      <w:pPr>
+        <w:pStyle w:val="Heading2"/>
+      </w:pPr>
+      <w:r>
+        <w:rPr>
+          <w:color w:val="1F3864"/>
+        </w:rPr>
         <w:t>Step 1. Open the repo and start a session (once per task)</w:t>
       </w:r>
     </w:p>
@@ -924,16 +1430,12 @@
         <w:t xml:space="preserve">Add the repo (first time only). </w:t>
       </w:r>
       <w:r>
-        <w:t xml:space="preserve">In the sidebar, click + next to Projects, then Open folder. Pick Repos\new-ai-tools. It </w:t>
+        <w:t>In the sidebar, click + next to Projects, then Open folder. Pick the tool's repo folder, for example Repos\climate-fiscal-ai-tools. It stays in the sidebar.</w:t>
       </w:r>
       <w:proofErr w:type="gramStart"/>
-      <w:r>
-        <w:t>stays</w:t>
-      </w:r>
+      <w:r/>
       <w:proofErr w:type="gramEnd"/>
-      <w:r>
-        <w:t xml:space="preserve"> in the sidebar.</w:t>
-      </w:r>
+      <w:r/>
     </w:p>
     <w:p>
       <w:pPr>
@@ -953,7 +1455,7 @@
         <w:t xml:space="preserve">Start a session. </w:t>
       </w:r>
       <w:r>
-        <w:t>Point at new-ai-tools in the sidebar and click the + next to it.</w:t>
+        <w:t>Point at the repo in the sidebar and click the + next to it.</w:t>
       </w:r>
     </w:p>
     <w:p>
@@ -1084,9 +1586,12 @@
     </w:p>
     <w:p>
       <w:pPr>
-        <w:pStyle w:val="Heading1"/>
-      </w:pPr>
-      <w:r>
+        <w:pStyle w:val="Heading2"/>
+      </w:pPr>
+      <w:r>
+        <w:rPr>
+          <w:color w:val="1F3864"/>
+        </w:rPr>
         <w:t>Step 2. Pick the model and the mode (every session)</w:t>
       </w:r>
     </w:p>
@@ -1264,19 +1769,66 @@
     </w:p>
     <w:p>
       <w:pPr>
-        <w:pStyle w:val="Heading1"/>
-      </w:pPr>
-      <w:r>
-        <w:lastRenderedPageBreak/>
-        <w:t xml:space="preserve">Excise diagnostic for </w:t>
+        <w:pStyle w:val="Heading2"/>
+      </w:pPr>
+      <w:r>
+        <w:rPr>
+          <w:color w:val="1F3864"/>
+        </w:rPr>
+        <w:t>Tool 1. Excise diagnostic for Indonesia  (Claude Opus · Interactive)</w:t>
       </w:r>
       <w:proofErr w:type="gramStart"/>
       <w:r>
-        <w:t>Indonesia  (</w:t>
+        <w:rPr>
+          <w:color w:val="1F3864"/>
+        </w:rPr>
       </w:r>
       <w:proofErr w:type="gramEnd"/>
       <w:r>
-        <w:t>Claude Opus · Interactive)</w:t>
+        <w:rPr>
+          <w:color w:val="1F3864"/>
+        </w:rPr>
+      </w:r>
+    </w:p>
+    <w:p>
+      <w:pPr>
+        <w:shd w:val="clear" w:color="auto" w:fill="EEF3F9"/>
+      </w:pPr>
+      <w:r>
+        <w:rPr>
+          <w:rFonts w:ascii="Arial" w:hAnsi="Arial"/>
+          <w:b/>
+          <w:color w:val="1F3864"/>
+          <w:sz w:val="21"/>
+        </w:rPr>
+        <w:t xml:space="preserve">Repo: </w:t>
+      </w:r>
+      <w:r>
+        <w:rPr>
+          <w:rFonts w:ascii="Arial" w:hAnsi="Arial"/>
+          <w:b w:val="0"/>
+          <w:color w:val="1F3864"/>
+          <w:sz w:val="21"/>
+        </w:rPr>
+        <w:t>https://github.com/cpmodelai/climate-fiscal-ai-tools</w:t>
+      </w:r>
+      <w:r>
+        <w:rPr>
+          <w:rFonts w:ascii="Arial" w:hAnsi="Arial"/>
+          <w:b/>
+          <w:color w:val="1F3864"/>
+          <w:sz w:val="21"/>
+        </w:rPr>
+        <w:t xml:space="preserve">    Folder: </w:t>
+      </w:r>
+      <w:r>
+        <w:rPr>
+          <w:rFonts w:ascii="Arial" w:hAnsi="Arial"/>
+          <w:b w:val="0"/>
+          <w:color w:val="1F3864"/>
+          <w:sz w:val="21"/>
+        </w:rPr>
+        <w:t>Repos\climate-fiscal-ai-tools</w:t>
       </w:r>
     </w:p>
     <w:p>
@@ -1519,19 +2071,66 @@
     </w:p>
     <w:p>
       <w:pPr>
-        <w:pStyle w:val="Heading1"/>
-      </w:pPr>
-      <w:r>
-        <w:lastRenderedPageBreak/>
-        <w:t xml:space="preserve">Add tax indicators to the </w:t>
+        <w:pStyle w:val="Heading2"/>
+      </w:pPr>
+      <w:r>
+        <w:rPr>
+          <w:color w:val="1F3864"/>
+        </w:rPr>
+        <w:t>Tool 2. Add tax indicators to the dashboard  (Claude Sonnet · Interactive)</w:t>
       </w:r>
       <w:proofErr w:type="gramStart"/>
       <w:r>
-        <w:t>dashboard  (</w:t>
+        <w:rPr>
+          <w:color w:val="1F3864"/>
+        </w:rPr>
       </w:r>
       <w:proofErr w:type="gramEnd"/>
       <w:r>
-        <w:t>Claude Sonnet · Interactive)</w:t>
+        <w:rPr>
+          <w:color w:val="1F3864"/>
+        </w:rPr>
+      </w:r>
+    </w:p>
+    <w:p>
+      <w:pPr>
+        <w:shd w:val="clear" w:color="auto" w:fill="EEF3F9"/>
+      </w:pPr>
+      <w:r>
+        <w:rPr>
+          <w:rFonts w:ascii="Arial" w:hAnsi="Arial"/>
+          <w:b/>
+          <w:color w:val="1F3864"/>
+          <w:sz w:val="21"/>
+        </w:rPr>
+        <w:t xml:space="preserve">Repo: </w:t>
+      </w:r>
+      <w:r>
+        <w:rPr>
+          <w:rFonts w:ascii="Arial" w:hAnsi="Arial"/>
+          <w:b w:val="0"/>
+          <w:color w:val="1F3864"/>
+          <w:sz w:val="21"/>
+        </w:rPr>
+        <w:t>https://github.com/cpmodelai/climate-fiscal-ai-tools</w:t>
+      </w:r>
+      <w:r>
+        <w:rPr>
+          <w:rFonts w:ascii="Arial" w:hAnsi="Arial"/>
+          <w:b/>
+          <w:color w:val="1F3864"/>
+          <w:sz w:val="21"/>
+        </w:rPr>
+        <w:t xml:space="preserve">    Folder: </w:t>
+      </w:r>
+      <w:r>
+        <w:rPr>
+          <w:rFonts w:ascii="Arial" w:hAnsi="Arial"/>
+          <w:b w:val="0"/>
+          <w:color w:val="1F3864"/>
+          <w:sz w:val="21"/>
+        </w:rPr>
+        <w:t>Repos\climate-fiscal-ai-tools</w:t>
       </w:r>
     </w:p>
     <w:p>
@@ -1687,9 +2286,189 @@
     </w:p>
     <w:p>
       <w:pPr>
-        <w:pStyle w:val="Heading1"/>
-      </w:pPr>
-      <w:r>
+        <w:pStyle w:val="Heading2"/>
+      </w:pPr>
+      <w:r>
+        <w:rPr>
+          <w:color w:val="1F3864"/>
+        </w:rPr>
+        <w:t>Tool 3. Make an update to CPAT-AI  (Claude Opus · Interactive)</w:t>
+      </w:r>
+    </w:p>
+    <w:p>
+      <w:pPr>
+        <w:shd w:val="clear" w:color="auto" w:fill="EEF3F9"/>
+      </w:pPr>
+      <w:r>
+        <w:rPr>
+          <w:rFonts w:ascii="Arial" w:hAnsi="Arial"/>
+          <w:b/>
+          <w:color w:val="1F3864"/>
+          <w:sz w:val="21"/>
+        </w:rPr>
+        <w:t xml:space="preserve">Repo: </w:t>
+      </w:r>
+      <w:r>
+        <w:rPr>
+          <w:rFonts w:ascii="Arial" w:hAnsi="Arial"/>
+          <w:b w:val="0"/>
+          <w:color w:val="1F3864"/>
+          <w:sz w:val="21"/>
+        </w:rPr>
+        <w:t>https://github.com/cpmodelai/cpat_ai</w:t>
+      </w:r>
+      <w:r>
+        <w:rPr>
+          <w:rFonts w:ascii="Arial" w:hAnsi="Arial"/>
+          <w:b/>
+          <w:color w:val="1F3864"/>
+          <w:sz w:val="21"/>
+        </w:rPr>
+        <w:t xml:space="preserve">    Folder: </w:t>
+      </w:r>
+      <w:r>
+        <w:rPr>
+          <w:rFonts w:ascii="Arial" w:hAnsi="Arial"/>
+          <w:b w:val="0"/>
+          <w:color w:val="1F3864"/>
+          <w:sz w:val="21"/>
+        </w:rPr>
+        <w:t>Repos\CPAT-AI</w:t>
+      </w:r>
+    </w:p>
+    <w:p>
+      <w:proofErr w:type="gramStart"/>
+      <w:proofErr w:type="gramEnd"/>
+      <w:r>
+        <w:t>Attach the rules: type @ and pick AGENTS.md (or drag the file onto the prompt box). It points Copilot to NORMS.md, CAVEATS.md and the to-do lists, so it follows the repo's rules.</w:t>
+      </w:r>
+    </w:p>
+    <w:p>
+      <w:proofErr w:type="gramStart"/>
+      <w:proofErr w:type="gramEnd"/>
+      <w:r>
+        <w:rPr>
+          <w:b/>
+        </w:rPr>
+        <w:t>Paste (fill in your change):</w:t>
+      </w:r>
+    </w:p>
+    <w:p>
+      <w:pPr>
+        <w:shd w:val="clear" w:color="auto" w:fill="F2F2F2"/>
+      </w:pPr>
+      <w:r>
+        <w:rPr>
+          <w:rFonts w:ascii="Consolas" w:hAnsi="Consolas"/>
+          <w:sz w:val="19"/>
+        </w:rPr>
+        <w:t>@AGENTS.md Follow this file and the documents it points to. In the mitigation prototype, &lt;describe your change&gt;. Never replicate a legacy bug; replicate legacy issues and register them. Rebuild, run excel_ai/mitigation/check_quick.py and show me the result. Then add the entry at the bottom of CAVEATS.md and update excel_ai/plans/TODO.md.</w:t>
+      </w:r>
+    </w:p>
+    <w:p>
+      <w:proofErr w:type="gramStart"/>
+      <w:proofErr w:type="gramEnd"/>
+      <w:r>
+        <w:rPr>
+          <w:b/>
+        </w:rPr>
+        <w:t>Then, one at a time:</w:t>
+      </w:r>
+    </w:p>
+    <w:p>
+      <w:pPr>
+        <w:shd w:val="clear" w:color="auto" w:fill="F2F2F2"/>
+      </w:pPr>
+      <w:r>
+        <w:rPr>
+          <w:rFonts w:ascii="Consolas" w:hAnsi="Consolas"/>
+          <w:sz w:val="19"/>
+        </w:rPr>
+        <w:t>Show me the changes before you save them.</w:t>
+      </w:r>
+    </w:p>
+    <w:p>
+      <w:pPr>
+        <w:shd w:val="clear" w:color="auto" w:fill="F2F2F2"/>
+      </w:pPr>
+      <w:r>
+        <w:rPr>
+          <w:rFonts w:ascii="Consolas" w:hAnsi="Consolas"/>
+          <w:sz w:val="19"/>
+        </w:rPr>
+        <w:t>Commit and push with a clear message.</w:t>
+      </w:r>
+    </w:p>
+    <w:p>
+      <w:proofErr w:type="gramStart"/>
+      <w:proofErr w:type="gramEnd"/>
+      <w:r>
+        <w:rPr>
+          <w:b/>
+        </w:rPr>
+        <w:t>Rules the repo sets (AGENTS.md):</w:t>
+      </w:r>
+    </w:p>
+    <w:p>
+      <w:proofErr w:type="gramStart"/>
+      <w:proofErr w:type="gramEnd"/>
+      <w:r>
+        <w:t>•  Never edit a released workbook: the build writes a new version.</w:t>
+      </w:r>
+    </w:p>
+    <w:p>
+      <w:proofErr w:type="gramStart"/>
+      <w:proofErr w:type="gramEnd"/>
+      <w:r>
+        <w:t>•  All data go in data/, with the script that converts them.</w:t>
+      </w:r>
+    </w:p>
+    <w:p>
+      <w:proofErr w:type="gramStart"/>
+      <w:proofErr w:type="gramEnd"/>
+      <w:r>
+        <w:t>•  Every finished task ends with an entry at the bottom of CAVEATS.md.</w:t>
+      </w:r>
+    </w:p>
+    <w:p>
+      <w:proofErr w:type="gramStart"/>
+      <w:proofErr w:type="gramEnd"/>
+      <w:r>
+        <w:t>•  Copilot does not commit unless you ask.</w:t>
+      </w:r>
+    </w:p>
+    <w:p>
+      <w:proofErr w:type="gramStart"/>
+      <w:proofErr w:type="gramEnd"/>
+      <w:r>
+        <w:t>•  The checks need Python 3, openpyxl and LibreOffice. Use Claude Sonnet for text-only edits.</w:t>
+      </w:r>
+    </w:p>
+    <w:p>
+      <w:proofErr w:type="spellStart"/>
+      <w:proofErr w:type="spellEnd"/>
+      <w:r>
+        <w:rPr>
+          <w:b/>
+        </w:rPr>
+        <w:t xml:space="preserve">Check: </w:t>
+      </w:r>
+      <w:r>
+        <w:rPr>
+          <w:b w:val="0"/>
+        </w:rPr>
+        <w:t>check_quick.py says PASS; a new entry at the bottom of CAVEATS.md; the change shows on github.com/cpmodelai/cpat_ai.</w:t>
+      </w:r>
+    </w:p>
+    <w:p/>
+    <w:p>
+      <w:pPr>
+        <w:pStyle w:val="Heading2"/>
+      </w:pPr>
+      <w:r>
+        <w:rPr>
+          <w:color w:val="1F3864"/>
+        </w:rPr>
         <w:t>Step 3. Save your work to GitHub</w:t>
       </w:r>
     </w:p>
@@ -1732,14 +2511,38 @@
         <w:t xml:space="preserve">Or use the script. </w:t>
       </w:r>
       <w:r>
-        <w:t>Double-click SyncRepo.bat in the repo folder.</w:t>
-      </w:r>
-    </w:p>
-    <w:p>
-      <w:pPr>
-        <w:pStyle w:val="Heading1"/>
-      </w:pPr>
-      <w:r>
+        <w:t>Double-click SyncAllRepos.bat in your Repos folder (all repos at once), or SyncRepo.bat in the repo folder where there is one.</w:t>
+      </w:r>
+    </w:p>
+    <w:p>
+      <w:pPr>
+        <w:ind w:left="397" w:hanging="397"/>
+      </w:pPr>
+      <w:r>
+        <w:rPr>
+          <w:b/>
+        </w:rPr>
+        <w:t>3.</w:t>
+        <w:tab/>
+      </w:r>
+      <w:r>
+        <w:rPr>
+          <w:b/>
+        </w:rPr>
+        <w:t xml:space="preserve">Check. </w:t>
+      </w:r>
+      <w:r>
+        <w:t>On github.com/cpmodelai/climate-fiscal-ai-tools (Tools 1-2) or github.com/cpmodelai/cpat_ai (Tool 3), your change shows as the latest commit.</w:t>
+      </w:r>
+    </w:p>
+    <w:p>
+      <w:pPr>
+        <w:pStyle w:val="Heading2"/>
+      </w:pPr>
+      <w:r>
+        <w:rPr>
+          <w:color w:val="1F3864"/>
+        </w:rPr>
         <w:t>Appendix</w:t>
       </w:r>
     </w:p>

</xml_diff>